<commit_message>
Add revised Team 2 consent forms, cleaned document set, and plan updates
- Replace participant consent and confidentiality agreement with revised versions
- Add separate audio recording consent form
- Add metadata-cleaned copies of Team 2 .docx files in *_cleaned folder
- Update IREC-aligned plan with revision status and open items

Co-Authored-By: Claude Opus 5.5 <noreply@anthropic.com>
</commit_message>
<xml_diff>
--- a/Team_2_Collaborative_Fire_Evacuation_Decision_Making_in_VR_IREC/Consent Forms/Arif_Participant consent-Eng_09222026.docx
+++ b/Team_2_Collaborative_Fire_Evacuation_Decision_Making_in_VR_IREC/Consent Forms/Arif_Participant consent-Eng_09222026.docx
@@ -14,12 +14,11 @@
       </w:pPr>
       <w:r>
         <w:rPr>
-          <w:rFonts w:ascii="Times New Roman" w:hAnsi="Times New Roman" w:cs="Times New Roman"/>
+          <w:rFonts w:ascii="Times New Roman" w:hAnsi="Times New Roman" w:eastAsia="Times New Roman" w:cs="Times New Roman"/>
           <w:b/>
           <w:sz w:val="24"/>
-          <w:szCs w:val="24"/>
         </w:rPr>
-        <w:t>Adaptive Uncertainty Visualization for Collaborative Emergency Decision-Making in Virtual Reality</w:t>
+        <w:t>Collaborative Fire-Evacuation Decision-Making in Virtual Reality: Analyst-Responder Communication, Navigation, and Workload</w:t>
       </w:r>
     </w:p>
     <w:tbl>
@@ -48,7 +47,7 @@
             </w:pPr>
             <w:r>
               <w:rPr>
-                <w:rFonts w:ascii="Times New Roman" w:hAnsi="Times New Roman" w:cs="Times New Roman"/>
+                <w:rFonts w:ascii="Times New Roman" w:hAnsi="Times New Roman" w:cs="Times New Roman" w:eastAsia="Times New Roman"/>
                 <w:b/>
                 <w:color w:val="000000" w:themeColor="text1"/>
                 <w:sz w:val="19"/>
@@ -71,43 +70,10 @@
             </w:pPr>
             <w:r>
               <w:rPr>
-                <w:rFonts w:ascii="Times New Roman" w:hAnsi="Times New Roman" w:cs="Times New Roman"/>
-                <w:color w:val="000000" w:themeColor="text1"/>
+                <w:rFonts w:ascii="Times New Roman" w:hAnsi="Times New Roman" w:eastAsia="Times New Roman" w:cs="Times New Roman"/>
                 <w:sz w:val="19"/>
               </w:rPr>
-              <w:t xml:space="preserve">Nazarbayev University; consent process in </w:t>
-            </w:r>
-            <w:r>
-              <w:rPr>
-                <w:rFonts w:ascii="Times New Roman" w:hAnsi="Times New Roman" w:cs="Times New Roman"/>
-                <w:color w:val="000000" w:themeColor="text1"/>
-                <w:sz w:val="19"/>
-              </w:rPr>
-              <w:t>Computer Laboratory</w:t>
-            </w:r>
-            <w:r>
-              <w:rPr>
-                <w:rFonts w:ascii="Times New Roman" w:hAnsi="Times New Roman" w:cs="Times New Roman"/>
-                <w:color w:val="000000" w:themeColor="text1"/>
-                <w:sz w:val="19"/>
-              </w:rPr>
-              <w:t xml:space="preserve"> (Room </w:t>
-            </w:r>
-            <w:r>
-              <w:rPr>
-                <w:rFonts w:ascii="Times New Roman" w:hAnsi="Times New Roman" w:cs="Times New Roman"/>
-                <w:color w:val="000000" w:themeColor="text1"/>
-                <w:sz w:val="19"/>
-              </w:rPr>
-              <w:t>7.522</w:t>
-            </w:r>
-            <w:r>
-              <w:rPr>
-                <w:rFonts w:ascii="Times New Roman" w:hAnsi="Times New Roman" w:cs="Times New Roman"/>
-                <w:color w:val="000000" w:themeColor="text1"/>
-                <w:sz w:val="19"/>
-              </w:rPr>
-              <w:t>) and study activities in the designated VR laboratory.</w:t>
+              <w:t>Nazarbayev University, Computer Lab (Room 7.522), where both the consent process and study activities will take place.</w:t>
             </w:r>
           </w:p>
         </w:tc>
@@ -127,7 +93,7 @@
             </w:pPr>
             <w:r>
               <w:rPr>
-                <w:rFonts w:ascii="Times New Roman" w:hAnsi="Times New Roman" w:cs="Times New Roman"/>
+                <w:rFonts w:ascii="Times New Roman" w:hAnsi="Times New Roman" w:cs="Times New Roman" w:eastAsia="Times New Roman"/>
                 <w:b/>
                 <w:color w:val="000000" w:themeColor="text1"/>
                 <w:sz w:val="19"/>
@@ -150,7 +116,7 @@
             </w:pPr>
             <w:r>
               <w:rPr>
-                <w:rFonts w:ascii="Times New Roman" w:hAnsi="Times New Roman" w:cs="Times New Roman"/>
+                <w:rFonts w:ascii="Times New Roman" w:hAnsi="Times New Roman" w:cs="Times New Roman" w:eastAsia="Times New Roman"/>
                 <w:b/>
                 <w:color w:val="000000" w:themeColor="text1"/>
                 <w:sz w:val="19"/>
@@ -175,7 +141,7 @@
             </w:pPr>
             <w:r>
               <w:rPr>
-                <w:rFonts w:ascii="Times New Roman" w:hAnsi="Times New Roman" w:cs="Times New Roman"/>
+                <w:rFonts w:ascii="Times New Roman" w:hAnsi="Times New Roman" w:cs="Times New Roman" w:eastAsia="Times New Roman"/>
                 <w:b/>
                 <w:color w:val="000000" w:themeColor="text1"/>
                 <w:sz w:val="19"/>
@@ -209,7 +175,7 @@
             </w:hyperlink>
             <w:r>
               <w:rPr>
-                <w:rFonts w:ascii="Times New Roman" w:hAnsi="Times New Roman" w:cs="Times New Roman"/>
+                <w:rFonts w:ascii="Times New Roman" w:hAnsi="Times New Roman" w:cs="Times New Roman" w:eastAsia="Times New Roman"/>
                 <w:b/>
                 <w:color w:val="000000" w:themeColor="text1"/>
                 <w:sz w:val="19"/>
@@ -218,7 +184,7 @@
             </w:r>
             <w:r>
               <w:rPr>
-                <w:rFonts w:ascii="Times New Roman" w:hAnsi="Times New Roman" w:cs="Times New Roman"/>
+                <w:rFonts w:ascii="Times New Roman" w:hAnsi="Times New Roman" w:cs="Times New Roman" w:eastAsia="Times New Roman"/>
                 <w:b/>
                 <w:color w:val="000000" w:themeColor="text1"/>
                 <w:sz w:val="19"/>
@@ -227,7 +193,7 @@
             </w:r>
             <w:r>
               <w:rPr>
-                <w:rFonts w:ascii="Times New Roman" w:hAnsi="Times New Roman" w:cs="Times New Roman"/>
+                <w:rFonts w:ascii="Times New Roman" w:hAnsi="Times New Roman" w:cs="Times New Roman" w:eastAsia="Times New Roman"/>
                 <w:b/>
                 <w:color w:val="000000" w:themeColor="text1"/>
                 <w:sz w:val="19"/>
@@ -252,7 +218,7 @@
             </w:pPr>
             <w:r>
               <w:rPr>
-                <w:rFonts w:ascii="Times New Roman" w:hAnsi="Times New Roman" w:cs="Times New Roman"/>
+                <w:rFonts w:ascii="Times New Roman" w:hAnsi="Times New Roman" w:cs="Times New Roman" w:eastAsia="Times New Roman"/>
                 <w:b/>
                 <w:color w:val="000000" w:themeColor="text1"/>
                 <w:sz w:val="19"/>
@@ -275,11 +241,10 @@
             </w:pPr>
             <w:r>
               <w:rPr>
-                <w:rFonts w:ascii="Times New Roman" w:hAnsi="Times New Roman" w:cs="Times New Roman"/>
-                <w:color w:val="000000" w:themeColor="text1"/>
+                <w:rFonts w:ascii="Times New Roman" w:hAnsi="Times New Roman" w:eastAsia="Times New Roman" w:cs="Times New Roman"/>
                 <w:sz w:val="19"/>
               </w:rPr>
-              <w:t>Approximately 35-45 minutes per participant pair.</w:t>
+              <w:t>Approximately 50-60 minutes per participant pair.</w:t>
             </w:r>
           </w:p>
         </w:tc>
@@ -298,7 +263,7 @@
       </w:pPr>
       <w:r>
         <w:rPr>
-          <w:rFonts w:ascii="Times New Roman" w:hAnsi="Times New Roman" w:cs="Times New Roman"/>
+          <w:rFonts w:ascii="Times New Roman" w:hAnsi="Times New Roman" w:cs="Times New Roman" w:eastAsia="Times New Roman"/>
           <w:color w:val="000000" w:themeColor="text1"/>
           <w:sz w:val="24"/>
           <w:szCs w:val="24"/>
@@ -318,7 +283,7 @@
       </w:pPr>
       <w:r>
         <w:rPr>
-          <w:rFonts w:ascii="Times New Roman" w:hAnsi="Times New Roman" w:cs="Times New Roman"/>
+          <w:rFonts w:ascii="Times New Roman" w:hAnsi="Times New Roman" w:cs="Times New Roman" w:eastAsia="Times New Roman"/>
           <w:color w:val="000000" w:themeColor="text1"/>
           <w:sz w:val="24"/>
           <w:szCs w:val="24"/>
@@ -327,7 +292,7 @@
       </w:r>
       <w:r>
         <w:rPr>
-          <w:rFonts w:ascii="Times New Roman" w:hAnsi="Times New Roman" w:cs="Times New Roman"/>
+          <w:rFonts w:ascii="Times New Roman" w:hAnsi="Times New Roman" w:cs="Times New Roman" w:eastAsia="Times New Roman"/>
           <w:b/>
           <w:bCs/>
           <w:color w:val="000000" w:themeColor="text1"/>
@@ -338,7 +303,7 @@
       </w:r>
       <w:r>
         <w:rPr>
-          <w:rFonts w:ascii="Times New Roman" w:hAnsi="Times New Roman" w:cs="Times New Roman"/>
+          <w:rFonts w:ascii="Times New Roman" w:hAnsi="Times New Roman" w:cs="Times New Roman" w:eastAsia="Times New Roman"/>
           <w:color w:val="000000" w:themeColor="text1"/>
           <w:sz w:val="24"/>
           <w:szCs w:val="24"/>
@@ -347,7 +312,7 @@
       </w:r>
       <w:r>
         <w:rPr>
-          <w:rFonts w:ascii="Times New Roman" w:hAnsi="Times New Roman" w:cs="Times New Roman"/>
+          <w:rFonts w:ascii="Times New Roman" w:hAnsi="Times New Roman" w:cs="Times New Roman" w:eastAsia="Times New Roman"/>
           <w:b/>
           <w:bCs/>
           <w:color w:val="000000" w:themeColor="text1"/>
@@ -370,7 +335,7 @@
       </w:pPr>
       <w:r>
         <w:rPr>
-          <w:rFonts w:ascii="Times New Roman" w:hAnsi="Times New Roman" w:cs="Times New Roman"/>
+          <w:rFonts w:ascii="Times New Roman" w:hAnsi="Times New Roman" w:cs="Times New Roman" w:eastAsia="Times New Roman"/>
           <w:color w:val="000000" w:themeColor="text1"/>
           <w:sz w:val="24"/>
           <w:szCs w:val="24"/>
@@ -390,43 +355,33 @@
       </w:pPr>
       <w:r>
         <w:rPr>
-          <w:rFonts w:ascii="Times New Roman" w:hAnsi="Times New Roman" w:cs="Times New Roman"/>
-          <w:color w:val="000000" w:themeColor="text1"/>
+          <w:rFonts w:ascii="Times New Roman" w:hAnsi="Times New Roman" w:eastAsia="Times New Roman" w:cs="Times New Roman"/>
           <w:sz w:val="24"/>
-          <w:szCs w:val="24"/>
         </w:rPr>
-        <w:t xml:space="preserve">The purpose of this study is to understand how different ways of presenting incomplete, uncertain, or conflicting information affect teamwork and decision-making in a shared VR emergency scenario. </w:t>
+        <w:t xml:space="preserve">The purpose of this study is to investigate collaborative decision-making during simulated fire-evacuation emergencies in Virtual Reality (VR) when important information is distributed between two team members. </w:t>
       </w:r>
       <w:r>
         <w:rPr>
-          <w:rFonts w:ascii="Times New Roman" w:hAnsi="Times New Roman" w:cs="Times New Roman"/>
+          <w:rFonts w:ascii="Times New Roman" w:hAnsi="Times New Roman" w:eastAsia="Times New Roman" w:cs="Times New Roman"/>
           <w:b/>
-          <w:bCs/>
-          <w:color w:val="000000" w:themeColor="text1"/>
           <w:sz w:val="24"/>
-          <w:szCs w:val="24"/>
         </w:rPr>
         <w:t>Two participants</w:t>
       </w:r>
       <w:r>
         <w:rPr>
-          <w:rFonts w:ascii="Times New Roman" w:hAnsi="Times New Roman" w:cs="Times New Roman"/>
-          <w:color w:val="000000" w:themeColor="text1"/>
+          <w:rFonts w:ascii="Times New Roman" w:hAnsi="Times New Roman" w:eastAsia="Times New Roman" w:cs="Times New Roman"/>
           <w:sz w:val="24"/>
-          <w:szCs w:val="24"/>
         </w:rPr>
-        <w:t xml:space="preserve"> work together but receive different information. The study compares private role-specific information, continuously shared information, and adaptive uncertainty cues that appear only when a relevant conflict or missing piece of evidence is detected. </w:t>
+        <w:t xml:space="preserve"> will work together: a Control-Room Analyst will have access to a building map, fire/smoke sensor information, hazard indicators, and exit status, while an On-Site Responder will navigate inside the virtual environment without a global map or advance knowledge of hazard locations. The study examines how communication and coordination relate to evacuation performance, route efficiency, navigation errors, workload, and system usability. </w:t>
       </w:r>
       <w:r>
         <w:rPr>
-          <w:rFonts w:ascii="Times New Roman" w:hAnsi="Times New Roman" w:cs="Times New Roman"/>
+          <w:rFonts w:ascii="Times New Roman" w:hAnsi="Times New Roman" w:eastAsia="Times New Roman" w:cs="Times New Roman"/>
           <w:b/>
-          <w:bCs/>
-          <w:color w:val="000000" w:themeColor="text1"/>
           <w:sz w:val="24"/>
-          <w:szCs w:val="24"/>
         </w:rPr>
-        <w:t>The study is a research prototype and is not professional emergency-response training.</w:t>
+        <w:t>The study is a research prototype and is not professional firefighting or emergency-response training.</w:t>
       </w:r>
     </w:p>
     <w:p>
@@ -442,7 +397,7 @@
       </w:pPr>
       <w:r>
         <w:rPr>
-          <w:rFonts w:ascii="Times New Roman" w:hAnsi="Times New Roman" w:cs="Times New Roman"/>
+          <w:rFonts w:ascii="Times New Roman" w:hAnsi="Times New Roman" w:cs="Times New Roman" w:eastAsia="Times New Roman"/>
           <w:color w:val="000000" w:themeColor="text1"/>
           <w:sz w:val="24"/>
           <w:szCs w:val="24"/>
@@ -462,52 +417,40 @@
       </w:pPr>
       <w:r>
         <w:rPr>
-          <w:rFonts w:ascii="Times New Roman" w:hAnsi="Times New Roman" w:cs="Times New Roman"/>
-          <w:color w:val="000000" w:themeColor="text1"/>
+          <w:rFonts w:ascii="Times New Roman" w:hAnsi="Times New Roman" w:eastAsia="Times New Roman" w:cs="Times New Roman"/>
           <w:sz w:val="24"/>
-          <w:szCs w:val="24"/>
         </w:rPr>
         <w:t xml:space="preserve">You will participate as part of a two-person team. One person will be assigned the role of a </w:t>
       </w:r>
       <w:r>
         <w:rPr>
-          <w:rFonts w:ascii="Times New Roman" w:hAnsi="Times New Roman" w:cs="Times New Roman"/>
+          <w:rFonts w:ascii="Times New Roman" w:hAnsi="Times New Roman" w:eastAsia="Times New Roman" w:cs="Times New Roman"/>
           <w:b/>
-          <w:bCs/>
-          <w:color w:val="000000" w:themeColor="text1"/>
           <w:sz w:val="24"/>
-          <w:szCs w:val="24"/>
         </w:rPr>
         <w:t>Control-Room Analyst</w:t>
       </w:r>
       <w:r>
         <w:rPr>
-          <w:rFonts w:ascii="Times New Roman" w:hAnsi="Times New Roman" w:cs="Times New Roman"/>
-          <w:color w:val="000000" w:themeColor="text1"/>
+          <w:rFonts w:ascii="Times New Roman" w:hAnsi="Times New Roman" w:eastAsia="Times New Roman" w:cs="Times New Roman"/>
           <w:sz w:val="24"/>
-          <w:szCs w:val="24"/>
         </w:rPr>
         <w:t xml:space="preserve"> and the other will be an </w:t>
       </w:r>
       <w:r>
         <w:rPr>
-          <w:rFonts w:ascii="Times New Roman" w:hAnsi="Times New Roman" w:cs="Times New Roman"/>
+          <w:rFonts w:ascii="Times New Roman" w:hAnsi="Times New Roman" w:eastAsia="Times New Roman" w:cs="Times New Roman"/>
           <w:b/>
-          <w:bCs/>
-          <w:color w:val="000000" w:themeColor="text1"/>
           <w:sz w:val="24"/>
-          <w:szCs w:val="24"/>
         </w:rPr>
         <w:t>On-Site Responder</w:t>
       </w:r>
       <w:r>
         <w:rPr>
-          <w:rFonts w:ascii="Times New Roman" w:hAnsi="Times New Roman" w:cs="Times New Roman"/>
-          <w:color w:val="000000" w:themeColor="text1"/>
+          <w:rFonts w:ascii="Times New Roman" w:hAnsi="Times New Roman" w:eastAsia="Times New Roman" w:cs="Times New Roman"/>
           <w:sz w:val="24"/>
-          <w:szCs w:val="24"/>
         </w:rPr>
-        <w:t>. The Analyst reviews virtual maps, alarms, sensor readings, and equipment information. The Responder uses a Meta Quest 2 headset to inspect rooms, hazards, workers, routes, and equipment in the virtual facility. You and your partner will communicate naturally and work together to make shared decisions.</w:t>
+        <w:t>. The Analyst will remain primarily stationary and use a building map, fire/smoke sensor readings, hazard indicators, and exit status. The Responder will use a Meta Quest 2 headset and navigate through the virtual facility without a global map, using local observations together with the Analyst's verbal guidance to identify and follow a safe evacuation route.</w:t>
       </w:r>
     </w:p>
     <w:p>
@@ -525,12 +468,10 @@
       </w:pPr>
       <w:r>
         <w:rPr>
-          <w:rFonts w:ascii="Times New Roman" w:hAnsi="Times New Roman" w:cs="Times New Roman"/>
-          <w:color w:val="000000" w:themeColor="text1"/>
+          <w:rFonts w:ascii="Times New Roman" w:hAnsi="Times New Roman" w:eastAsia="Times New Roman" w:cs="Times New Roman"/>
           <w:sz w:val="24"/>
-          <w:szCs w:val="24"/>
         </w:rPr>
-        <w:t>Complete a brief consent and background stage, including previous VR experience.</w:t>
+        <w:t>Complete a brief consent and background stage, including age range, previous VR experience, and familiarity with VR controls.</w:t>
       </w:r>
     </w:p>
     <w:p>
@@ -548,30 +489,10 @@
       </w:pPr>
       <w:r>
         <w:rPr>
-          <w:rFonts w:ascii="Times New Roman" w:hAnsi="Times New Roman" w:cs="Times New Roman"/>
-          <w:color w:val="000000" w:themeColor="text1"/>
+          <w:rFonts w:ascii="Times New Roman" w:hAnsi="Times New Roman" w:eastAsia="Times New Roman" w:cs="Times New Roman"/>
           <w:sz w:val="24"/>
-          <w:szCs w:val="24"/>
         </w:rPr>
-        <w:t xml:space="preserve">Receive a short tutorial and complete one practice trial so you are familiar with the VR controls and study </w:t>
-      </w:r>
-      <w:r>
-        <w:rPr>
-          <w:rFonts w:ascii="Times New Roman" w:hAnsi="Times New Roman" w:cs="Times New Roman"/>
-          <w:color w:val="000000" w:themeColor="text1"/>
-          <w:sz w:val="24"/>
-          <w:szCs w:val="24"/>
-        </w:rPr>
-        <w:t>tasks</w:t>
-      </w:r>
-      <w:r>
-        <w:rPr>
-          <w:rFonts w:ascii="Times New Roman" w:hAnsi="Times New Roman" w:cs="Times New Roman"/>
-          <w:color w:val="000000" w:themeColor="text1"/>
-          <w:sz w:val="24"/>
-          <w:szCs w:val="24"/>
-        </w:rPr>
-        <w:t>.</w:t>
+        <w:t>Receive a short tutorial and complete one practice trial so you are familiar with your assigned role, the VR controls, and the study tasks.</w:t>
       </w:r>
     </w:p>
     <w:p>
@@ -589,12 +510,10 @@
       </w:pPr>
       <w:r>
         <w:rPr>
-          <w:rFonts w:ascii="Times New Roman" w:hAnsi="Times New Roman" w:cs="Times New Roman"/>
-          <w:color w:val="000000" w:themeColor="text1"/>
+          <w:rFonts w:ascii="Times New Roman" w:hAnsi="Times New Roman" w:eastAsia="Times New Roman" w:cs="Times New Roman"/>
           <w:sz w:val="24"/>
-          <w:szCs w:val="24"/>
         </w:rPr>
-        <w:t>Complete matched emergency scenarios under three information-sharing conditions: private, always-shared, and adaptive.</w:t>
+        <w:t>Complete three non-graphic fire-evacuation scenarios: a blocked primary exit, a dynamic hazard update that requires route replanning, and a competing-routes scenario.</w:t>
       </w:r>
     </w:p>
     <w:p>
@@ -612,12 +531,10 @@
       </w:pPr>
       <w:r>
         <w:rPr>
-          <w:rFonts w:ascii="Times New Roman" w:hAnsi="Times New Roman" w:cs="Times New Roman"/>
-          <w:color w:val="000000" w:themeColor="text1"/>
+          <w:rFonts w:ascii="Times New Roman" w:hAnsi="Times New Roman" w:eastAsia="Times New Roman" w:cs="Times New Roman"/>
           <w:sz w:val="24"/>
-          <w:szCs w:val="24"/>
         </w:rPr>
-        <w:t>Work with your partner to decide the likely emergency source, an evacuation route, an equipment action, and rescue priority.</w:t>
+        <w:t>Communicate with your partner to identify and follow a safe evacuation route. The On-Site Responder will move using continuous controller-based locomotion rather than teleportation.</w:t>
       </w:r>
     </w:p>
     <w:p>
@@ -635,12 +552,10 @@
       </w:pPr>
       <w:r>
         <w:rPr>
-          <w:rFonts w:ascii="Times New Roman" w:hAnsi="Times New Roman" w:cs="Times New Roman"/>
-          <w:color w:val="000000" w:themeColor="text1"/>
+          <w:rFonts w:ascii="Times New Roman" w:hAnsi="Times New Roman" w:eastAsia="Times New Roman" w:cs="Times New Roman"/>
           <w:sz w:val="24"/>
-          <w:szCs w:val="24"/>
         </w:rPr>
-        <w:t>Complete short questionnaires about workload, trust, confidence, shared awareness, usability, and information overload, and provide brief comments about the interface.</w:t>
+        <w:t>After each scenario, complete the NASA-TLX workload questionnaire and a communication-quality questionnaire. After all scenarios, complete the System Usability Scale (SUS) and provide brief open-ended feedback about communication, navigation, usability, and discomfort.</w:t>
       </w:r>
     </w:p>
     <w:p>
@@ -655,32 +570,25 @@
       </w:pPr>
       <w:r>
         <w:rPr>
-          <w:rFonts w:ascii="Times New Roman" w:hAnsi="Times New Roman" w:cs="Times New Roman"/>
-          <w:color w:val="000000" w:themeColor="text1"/>
+          <w:rFonts w:ascii="Times New Roman" w:hAnsi="Times New Roman" w:eastAsia="Times New Roman" w:cs="Times New Roman"/>
           <w:sz w:val="24"/>
-          <w:szCs w:val="24"/>
         </w:rPr>
-        <w:t xml:space="preserve">The VR system will automatically record task-related information such as decisions, response times, evidence inspections, room visits, teleports, revisits, and other navigation events. </w:t>
+        <w:t xml:space="preserve">The VR system will automatically record task-performance and navigation information, including evacuation success, completion time, movement path, route length, wrong turns, blocked or unsafe route attempts, route changes, and relevant interaction events. Communication-system timestamps and network logs may also be collected to characterize delay and jitter. </w:t>
       </w:r>
       <w:r>
         <w:rPr>
-          <w:rFonts w:ascii="Times New Roman" w:hAnsi="Times New Roman" w:cs="Times New Roman"/>
+          <w:rFonts w:ascii="Times New Roman" w:hAnsi="Times New Roman" w:eastAsia="Times New Roman" w:cs="Times New Roman"/>
           <w:b/>
-          <w:bCs/>
-          <w:color w:val="000000" w:themeColor="text1"/>
           <w:sz w:val="24"/>
-          <w:szCs w:val="24"/>
         </w:rPr>
-        <w:t>Audio and video of participants will not be recorded</w:t>
+        <w:t>Audio communication between you and your partner will be recorded</w:t>
       </w:r>
       <w:r>
         <w:rPr>
-          <w:rFonts w:ascii="Times New Roman" w:hAnsi="Times New Roman" w:cs="Times New Roman"/>
-          <w:color w:val="000000" w:themeColor="text1"/>
+          <w:rFonts w:ascii="Times New Roman" w:hAnsi="Times New Roman" w:eastAsia="Times New Roman" w:cs="Times New Roman"/>
           <w:sz w:val="24"/>
-          <w:szCs w:val="24"/>
         </w:rPr>
-        <w:t>.</w:t>
+        <w:t xml:space="preserve"> to verify communication timing and count predefined events such as clarification requests, repeated instructions, or communication breakdowns. No video or biometric recordings will be collected.</w:t>
       </w:r>
     </w:p>
     <w:p>
@@ -696,7 +604,7 @@
       </w:pPr>
       <w:r>
         <w:rPr>
-          <w:rFonts w:ascii="Times New Roman" w:hAnsi="Times New Roman" w:cs="Times New Roman"/>
+          <w:rFonts w:ascii="Times New Roman" w:hAnsi="Times New Roman" w:cs="Times New Roman" w:eastAsia="Times New Roman"/>
           <w:color w:val="000000" w:themeColor="text1"/>
           <w:sz w:val="24"/>
           <w:szCs w:val="24"/>
@@ -716,100 +624,40 @@
       </w:pPr>
       <w:r>
         <w:rPr>
-          <w:rFonts w:ascii="Times New Roman" w:hAnsi="Times New Roman" w:cs="Times New Roman"/>
-          <w:color w:val="000000" w:themeColor="text1"/>
+          <w:rFonts w:ascii="Times New Roman" w:hAnsi="Times New Roman" w:eastAsia="Times New Roman" w:cs="Times New Roman"/>
           <w:sz w:val="24"/>
-          <w:szCs w:val="24"/>
         </w:rPr>
         <w:t xml:space="preserve">This study is considered minimal risk. </w:t>
       </w:r>
       <w:r>
         <w:rPr>
-          <w:rFonts w:ascii="Times New Roman" w:hAnsi="Times New Roman" w:cs="Times New Roman"/>
+          <w:rFonts w:ascii="Times New Roman" w:hAnsi="Times New Roman" w:eastAsia="Times New Roman" w:cs="Times New Roman"/>
           <w:b/>
-          <w:bCs/>
-          <w:color w:val="000000" w:themeColor="text1"/>
           <w:sz w:val="24"/>
-          <w:szCs w:val="24"/>
         </w:rPr>
         <w:t>You may experience</w:t>
       </w:r>
       <w:r>
         <w:rPr>
-          <w:rFonts w:ascii="Times New Roman" w:hAnsi="Times New Roman" w:cs="Times New Roman"/>
-          <w:color w:val="000000" w:themeColor="text1"/>
+          <w:rFonts w:ascii="Times New Roman" w:hAnsi="Times New Roman" w:eastAsia="Times New Roman" w:cs="Times New Roman"/>
           <w:sz w:val="24"/>
-          <w:szCs w:val="24"/>
         </w:rPr>
-        <w:t xml:space="preserve"> mild and temporary effects commonly associated with VR use, such as eye strain, dizziness, slight motion sickness, or discomfort from wearing the headset. The fictional emergency scenario may also cause minor temporary stress. To reduce these risks, the study uses teleportation and snap turning rather than continuous artificial movement, the scenarios are non-graphic, and breaks are available. </w:t>
+        <w:t xml:space="preserve"> mild and temporary effects commonly associated with VR use, such as eye strain, dizziness, cybersickness or motion sickness, fatigue, or discomfort from wearing the headset. Continuous controller-based locomotion may increase motion discomfort for some participants. The fictional, non-graphic fire scenarios may also cause mild temporary stress because of alarms, smoke effects, time pressure, or safety-related decisions. Risks will be reduced through screening, a practice session, moderate movement speed, snap turning where appropriate, short trials, and breaks between scenarios. </w:t>
       </w:r>
       <w:r>
         <w:rPr>
-          <w:rFonts w:ascii="Times New Roman" w:hAnsi="Times New Roman" w:cs="Times New Roman"/>
+          <w:rFonts w:ascii="Times New Roman" w:hAnsi="Times New Roman" w:eastAsia="Times New Roman" w:cs="Times New Roman"/>
           <w:b/>
-          <w:bCs/>
-          <w:color w:val="000000" w:themeColor="text1"/>
           <w:sz w:val="24"/>
-          <w:szCs w:val="24"/>
         </w:rPr>
-        <w:t>You may pause or stop</w:t>
+        <w:t>You may pause or stop the session immediately at any time.</w:t>
       </w:r>
       <w:r>
         <w:rPr>
-          <w:rFonts w:ascii="Times New Roman" w:hAnsi="Times New Roman" w:cs="Times New Roman"/>
-          <w:color w:val="000000" w:themeColor="text1"/>
+          <w:rFonts w:ascii="Times New Roman" w:hAnsi="Times New Roman" w:eastAsia="Times New Roman" w:cs="Times New Roman"/>
           <w:sz w:val="24"/>
-          <w:szCs w:val="24"/>
         </w:rPr>
-        <w:t xml:space="preserve"> the </w:t>
-      </w:r>
-      <w:r>
-        <w:rPr>
-          <w:rFonts w:ascii="Times New Roman" w:hAnsi="Times New Roman" w:cs="Times New Roman"/>
-          <w:color w:val="000000" w:themeColor="text1"/>
-          <w:sz w:val="24"/>
-          <w:szCs w:val="24"/>
-        </w:rPr>
-        <w:lastRenderedPageBreak/>
-        <w:t xml:space="preserve">session </w:t>
-      </w:r>
-      <w:r>
-        <w:rPr>
-          <w:rFonts w:ascii="Times New Roman" w:hAnsi="Times New Roman" w:cs="Times New Roman"/>
-          <w:b/>
-          <w:bCs/>
-          <w:color w:val="000000" w:themeColor="text1"/>
-          <w:sz w:val="24"/>
-          <w:szCs w:val="24"/>
-        </w:rPr>
-        <w:t>immediately at any time</w:t>
-      </w:r>
-      <w:r>
-        <w:rPr>
-          <w:rFonts w:ascii="Times New Roman" w:hAnsi="Times New Roman" w:cs="Times New Roman"/>
-          <w:color w:val="000000" w:themeColor="text1"/>
-          <w:sz w:val="24"/>
-          <w:szCs w:val="24"/>
-        </w:rPr>
-        <w:t xml:space="preserve">. If you feel unwell, the headset will be </w:t>
-      </w:r>
-      <w:r>
-        <w:rPr>
-          <w:rFonts w:ascii="Times New Roman" w:hAnsi="Times New Roman" w:cs="Times New Roman"/>
-          <w:color w:val="000000" w:themeColor="text1"/>
-          <w:sz w:val="24"/>
-          <w:szCs w:val="24"/>
-        </w:rPr>
-        <w:t>removed,</w:t>
-      </w:r>
-      <w:r>
-        <w:rPr>
-          <w:rFonts w:ascii="Times New Roman" w:hAnsi="Times New Roman" w:cs="Times New Roman"/>
-          <w:color w:val="000000" w:themeColor="text1"/>
-          <w:sz w:val="24"/>
-          <w:szCs w:val="24"/>
-        </w:rPr>
-        <w:t xml:space="preserve"> and the session will be stopped. Individuals for whom VR use may be unsafe will be excluded during screening.</w:t>
+        <w:t xml:space="preserve"> If you feel unwell, the headset will be removed and the session will be stopped.</w:t>
       </w:r>
     </w:p>
     <w:p>
@@ -825,7 +673,7 @@
       </w:pPr>
       <w:r>
         <w:rPr>
-          <w:rFonts w:ascii="Times New Roman" w:hAnsi="Times New Roman" w:cs="Times New Roman"/>
+          <w:rFonts w:ascii="Times New Roman" w:hAnsi="Times New Roman" w:cs="Times New Roman" w:eastAsia="Times New Roman"/>
           <w:color w:val="000000" w:themeColor="text1"/>
           <w:sz w:val="24"/>
           <w:szCs w:val="24"/>
@@ -845,54 +693,25 @@
       </w:pPr>
       <w:r>
         <w:rPr>
-          <w:rFonts w:ascii="Times New Roman" w:hAnsi="Times New Roman" w:cs="Times New Roman"/>
-          <w:color w:val="000000" w:themeColor="text1"/>
+          <w:rFonts w:ascii="Times New Roman" w:hAnsi="Times New Roman" w:eastAsia="Times New Roman" w:cs="Times New Roman"/>
           <w:sz w:val="24"/>
-          <w:szCs w:val="24"/>
         </w:rPr>
-        <w:t xml:space="preserve">You may benefit from gaining hands-on experience with a collaborative VR system and from learning how information sharing, uncertainty, and communication can influence team decisions. </w:t>
+        <w:t xml:space="preserve">You may receive an indirect benefit from experiencing a collaborative VR system and reflecting on communication and decision-making when team members have different information. </w:t>
       </w:r>
       <w:r>
         <w:rPr>
-          <w:rFonts w:ascii="Times New Roman" w:hAnsi="Times New Roman" w:cs="Times New Roman"/>
+          <w:rFonts w:ascii="Times New Roman" w:hAnsi="Times New Roman" w:eastAsia="Times New Roman" w:cs="Times New Roman"/>
           <w:b/>
-          <w:bCs/>
-          <w:color w:val="000000" w:themeColor="text1"/>
           <w:sz w:val="24"/>
-          <w:szCs w:val="24"/>
         </w:rPr>
-        <w:t xml:space="preserve">There is no guarantee of </w:t>
+        <w:t>There is no guarantee of direct personal benefit.</w:t>
       </w:r>
       <w:r>
         <w:rPr>
-          <w:rFonts w:ascii="Times New Roman" w:hAnsi="Times New Roman" w:cs="Times New Roman"/>
-          <w:b/>
-          <w:bCs/>
-          <w:color w:val="000000" w:themeColor="text1"/>
+          <w:rFonts w:ascii="Times New Roman" w:hAnsi="Times New Roman" w:eastAsia="Times New Roman" w:cs="Times New Roman"/>
           <w:sz w:val="24"/>
-          <w:szCs w:val="24"/>
         </w:rPr>
-        <w:t>direct</w:t>
-      </w:r>
-      <w:r>
-        <w:rPr>
-          <w:rFonts w:ascii="Times New Roman" w:hAnsi="Times New Roman" w:cs="Times New Roman"/>
-          <w:b/>
-          <w:bCs/>
-          <w:color w:val="000000" w:themeColor="text1"/>
-          <w:sz w:val="24"/>
-          <w:szCs w:val="24"/>
-        </w:rPr>
-        <w:t xml:space="preserve"> personal benefit</w:t>
-      </w:r>
-      <w:r>
-        <w:rPr>
-          <w:rFonts w:ascii="Times New Roman" w:hAnsi="Times New Roman" w:cs="Times New Roman"/>
-          <w:color w:val="000000" w:themeColor="text1"/>
-          <w:sz w:val="24"/>
-          <w:szCs w:val="24"/>
-        </w:rPr>
-        <w:t>. The study may contribute to the design of future collaborative VR systems that support shared awareness and decision-making without overwhelming users with unnecessary information.</w:t>
+        <w:t xml:space="preserve"> The study may contribute to a better understanding of how remote guidance, communication quality, information asymmetry, workload, and usability affect collaborative navigation and decision-making in simulated fire evacuation. The study is not professional fire-safety training and does not certify participants in emergency-response procedures.</w:t>
       </w:r>
     </w:p>
     <w:p>
@@ -908,7 +727,7 @@
       </w:pPr>
       <w:r>
         <w:rPr>
-          <w:rFonts w:ascii="Times New Roman" w:hAnsi="Times New Roman" w:cs="Times New Roman"/>
+          <w:rFonts w:ascii="Times New Roman" w:hAnsi="Times New Roman" w:cs="Times New Roman" w:eastAsia="Times New Roman"/>
           <w:color w:val="000000" w:themeColor="text1"/>
           <w:sz w:val="24"/>
           <w:szCs w:val="24"/>
@@ -928,7 +747,7 @@
       </w:pPr>
       <w:r>
         <w:rPr>
-          <w:rFonts w:ascii="Times New Roman" w:hAnsi="Times New Roman" w:cs="Times New Roman"/>
+          <w:rFonts w:ascii="Times New Roman" w:hAnsi="Times New Roman" w:cs="Times New Roman" w:eastAsia="Times New Roman"/>
           <w:b/>
           <w:bCs/>
           <w:color w:val="000000" w:themeColor="text1"/>
@@ -939,7 +758,7 @@
       </w:r>
       <w:r>
         <w:rPr>
-          <w:rFonts w:ascii="Times New Roman" w:hAnsi="Times New Roman" w:cs="Times New Roman"/>
+          <w:rFonts w:ascii="Times New Roman" w:hAnsi="Times New Roman" w:cs="Times New Roman" w:eastAsia="Times New Roman"/>
           <w:color w:val="000000" w:themeColor="text1"/>
           <w:sz w:val="24"/>
           <w:szCs w:val="24"/>
@@ -948,7 +767,7 @@
       </w:r>
       <w:r>
         <w:rPr>
-          <w:rFonts w:ascii="Times New Roman" w:hAnsi="Times New Roman" w:cs="Times New Roman"/>
+          <w:rFonts w:ascii="Times New Roman" w:hAnsi="Times New Roman" w:cs="Times New Roman" w:eastAsia="Times New Roman"/>
           <w:b/>
           <w:bCs/>
           <w:color w:val="000000" w:themeColor="text1"/>
@@ -959,7 +778,7 @@
       </w:r>
       <w:r>
         <w:rPr>
-          <w:rFonts w:ascii="Times New Roman" w:hAnsi="Times New Roman" w:cs="Times New Roman"/>
+          <w:rFonts w:ascii="Times New Roman" w:hAnsi="Times New Roman" w:cs="Times New Roman" w:eastAsia="Times New Roman"/>
           <w:color w:val="000000" w:themeColor="text1"/>
           <w:sz w:val="24"/>
           <w:szCs w:val="24"/>
@@ -969,7 +788,7 @@
       <w:proofErr w:type="gramStart"/>
       <w:r>
         <w:rPr>
-          <w:rFonts w:ascii="Times New Roman" w:hAnsi="Times New Roman" w:cs="Times New Roman"/>
+          <w:rFonts w:ascii="Times New Roman" w:hAnsi="Times New Roman" w:cs="Times New Roman" w:eastAsia="Times New Roman"/>
           <w:color w:val="000000" w:themeColor="text1"/>
           <w:sz w:val="24"/>
           <w:szCs w:val="24"/>
@@ -979,7 +798,7 @@
       <w:proofErr w:type="gramEnd"/>
       <w:r>
         <w:rPr>
-          <w:rFonts w:ascii="Times New Roman" w:hAnsi="Times New Roman" w:cs="Times New Roman"/>
+          <w:rFonts w:ascii="Times New Roman" w:hAnsi="Times New Roman" w:cs="Times New Roman" w:eastAsia="Times New Roman"/>
           <w:color w:val="000000" w:themeColor="text1"/>
           <w:sz w:val="24"/>
           <w:szCs w:val="24"/>
@@ -1000,7 +819,7 @@
       </w:pPr>
       <w:r>
         <w:rPr>
-          <w:rFonts w:ascii="Times New Roman" w:hAnsi="Times New Roman" w:cs="Times New Roman"/>
+          <w:rFonts w:ascii="Times New Roman" w:hAnsi="Times New Roman" w:cs="Times New Roman" w:eastAsia="Times New Roman"/>
           <w:color w:val="000000" w:themeColor="text1"/>
           <w:sz w:val="24"/>
           <w:szCs w:val="24"/>
@@ -1020,12 +839,10 @@
       </w:pPr>
       <w:r>
         <w:rPr>
-          <w:rFonts w:ascii="Times New Roman" w:hAnsi="Times New Roman" w:cs="Times New Roman"/>
-          <w:color w:val="000000" w:themeColor="text1"/>
+          <w:rFonts w:ascii="Times New Roman" w:hAnsi="Times New Roman" w:eastAsia="Times New Roman" w:cs="Times New Roman"/>
           <w:sz w:val="24"/>
-          <w:szCs w:val="24"/>
         </w:rPr>
-        <w:t>Your identity will be protected as far as reasonably possible. Your name and contact information will be used only for recruitment, scheduling, and consent. Each participant will receive a participant code (for example, P01) and each pair will receive a pair code (for example, Pair01). These codes, rather than names, will be used in VR performance logs, questionnaires, and analysis files.</w:t>
+        <w:t>Your identity will be protected as far as reasonably possible. Your name and contact information will be used only for recruitment, scheduling, and consent. Each participant will receive a participant code (for example, P01) and each pair will receive a pair code (for example, Pair01). These codes, rather than names or student IDs, will be used in VR performance logs, communication logs, questionnaires, analysis files, and coded audio filenames.</w:t>
       </w:r>
     </w:p>
     <w:p>
@@ -1040,12 +857,10 @@
       </w:pPr>
       <w:r>
         <w:rPr>
-          <w:rFonts w:ascii="Times New Roman" w:hAnsi="Times New Roman" w:cs="Times New Roman"/>
-          <w:color w:val="000000" w:themeColor="text1"/>
+          <w:rFonts w:ascii="Times New Roman" w:hAnsi="Times New Roman" w:eastAsia="Times New Roman" w:cs="Times New Roman"/>
           <w:sz w:val="24"/>
-          <w:szCs w:val="24"/>
         </w:rPr>
-        <w:t>Electronic research data will be stored on a password-protected research computer at Nazarbayev University. Signed consent forms and any document linking names to study codes will be stored separately from the research dataset in a locked cabinet. Access will be limited to the research team. Results will be reported only in aggregate or de-identified form. No student IDs, audio recordings, video recordings, or identifiable biometric data will be included in the research dataset. Although reasonable safeguards will be used, complete confidentiality cannot be guaranteed.</w:t>
+        <w:t>Electronic research data, including VR logs, communication logs, questionnaire responses, and coded raw audio recordings, will be stored on a password-protected research computer at Nazarbayev University with access limited to the research team. Signed consent forms and any document linking names to study codes will be stored separately in a locked cabinet. Because a voice may be recognizable, raw audio will be treated as confidential identifiable research data. Audio will be used only for the predefined communication analysis; the study will not perform voice recognition, speaker identification, or unrelated analysis of speech content. Results will be reported only in aggregate or de-identified form, and raw audio clips will not be included in presentations, publications, or shared datasets. Research records will be retained for at least three years after dissemination or final reporting and then securely deleted or destroyed. Although reasonable safeguards will be used, complete confidentiality cannot be guaranteed.</w:t>
       </w:r>
     </w:p>
     <w:p>
@@ -1061,7 +876,7 @@
       </w:pPr>
       <w:r>
         <w:rPr>
-          <w:rFonts w:ascii="Times New Roman" w:hAnsi="Times New Roman" w:cs="Times New Roman"/>
+          <w:rFonts w:ascii="Times New Roman" w:hAnsi="Times New Roman" w:cs="Times New Roman" w:eastAsia="Times New Roman"/>
           <w:color w:val="000000" w:themeColor="text1"/>
           <w:sz w:val="24"/>
           <w:szCs w:val="24"/>
@@ -1081,7 +896,7 @@
       </w:pPr>
       <w:r>
         <w:rPr>
-          <w:rFonts w:ascii="Times New Roman" w:hAnsi="Times New Roman" w:cs="Times New Roman"/>
+          <w:rFonts w:ascii="Times New Roman" w:hAnsi="Times New Roman" w:cs="Times New Roman" w:eastAsia="Times New Roman"/>
           <w:b/>
           <w:bCs/>
           <w:color w:val="000000" w:themeColor="text1"/>
@@ -1092,7 +907,7 @@
       </w:r>
       <w:r>
         <w:rPr>
-          <w:rFonts w:ascii="Times New Roman" w:hAnsi="Times New Roman" w:cs="Times New Roman"/>
+          <w:rFonts w:ascii="Times New Roman" w:hAnsi="Times New Roman" w:cs="Times New Roman" w:eastAsia="Times New Roman"/>
           <w:color w:val="000000" w:themeColor="text1"/>
           <w:sz w:val="24"/>
           <w:szCs w:val="24"/>
@@ -1112,30 +927,10 @@
       </w:pPr>
       <w:r>
         <w:rPr>
-          <w:rFonts w:ascii="Times New Roman" w:hAnsi="Times New Roman" w:cs="Times New Roman"/>
-          <w:color w:val="000000" w:themeColor="text1"/>
+          <w:rFonts w:ascii="Times New Roman" w:hAnsi="Times New Roman" w:eastAsia="Times New Roman" w:cs="Times New Roman"/>
           <w:sz w:val="24"/>
-          <w:szCs w:val="24"/>
         </w:rPr>
-        <w:t xml:space="preserve">If you withdraw during a paired VR trial, the current collaborative trial will stop because it requires two participants. You may ask for data collected before withdrawal to be excluded while it can still be linked to your participant code. Once data </w:t>
-      </w:r>
-      <w:r>
-        <w:rPr>
-          <w:rFonts w:ascii="Times New Roman" w:hAnsi="Times New Roman" w:cs="Times New Roman"/>
-          <w:color w:val="000000" w:themeColor="text1"/>
-          <w:sz w:val="24"/>
-          <w:szCs w:val="24"/>
-        </w:rPr>
-        <w:t>has</w:t>
-      </w:r>
-      <w:r>
-        <w:rPr>
-          <w:rFonts w:ascii="Times New Roman" w:hAnsi="Times New Roman" w:cs="Times New Roman"/>
-          <w:color w:val="000000" w:themeColor="text1"/>
-          <w:sz w:val="24"/>
-          <w:szCs w:val="24"/>
-        </w:rPr>
-        <w:t xml:space="preserve"> been fully de-identified and combined into aggregate results, it may no longer be possible to identify and remove an individual record.</w:t>
+        <w:t>If you withdraw during a paired VR trial, the current collaborative trial will stop because it requires two participants. You may ask for data already collected from your participation to be excluded while it can still be linked to your temporary participant or pair code; where applicable, the related individual and pair-level trial data will be removed. Once data have been fully de-identified and incorporated into aggregate results, it may no longer be possible to identify and remove an individual record.</w:t>
       </w:r>
     </w:p>
     <w:p>
@@ -1151,7 +946,7 @@
       </w:pPr>
       <w:r>
         <w:rPr>
-          <w:rFonts w:ascii="Times New Roman" w:hAnsi="Times New Roman" w:cs="Times New Roman"/>
+          <w:rFonts w:ascii="Times New Roman" w:hAnsi="Times New Roman" w:cs="Times New Roman" w:eastAsia="Times New Roman"/>
           <w:color w:val="000000" w:themeColor="text1"/>
           <w:sz w:val="24"/>
           <w:szCs w:val="24"/>
@@ -1170,7 +965,7 @@
       </w:pPr>
       <w:r>
         <w:rPr>
-          <w:rFonts w:ascii="Times New Roman" w:hAnsi="Times New Roman" w:cs="Times New Roman"/>
+          <w:rFonts w:ascii="Times New Roman" w:hAnsi="Times New Roman" w:cs="Times New Roman" w:eastAsia="Times New Roman"/>
           <w:sz w:val="24"/>
           <w:szCs w:val="24"/>
         </w:rPr>
@@ -1178,7 +973,7 @@
       </w:r>
       <w:r>
         <w:rPr>
-          <w:rFonts w:ascii="Times New Roman" w:hAnsi="Times New Roman" w:cs="Times New Roman"/>
+          <w:rFonts w:ascii="Times New Roman" w:hAnsi="Times New Roman" w:cs="Times New Roman" w:eastAsia="Times New Roman"/>
           <w:b/>
           <w:bCs/>
           <w:sz w:val="24"/>
@@ -1188,7 +983,7 @@
       </w:r>
       <w:r>
         <w:rPr>
-          <w:rFonts w:ascii="Times New Roman" w:hAnsi="Times New Roman" w:cs="Times New Roman"/>
+          <w:rFonts w:ascii="Times New Roman" w:hAnsi="Times New Roman" w:cs="Times New Roman" w:eastAsia="Times New Roman"/>
           <w:b/>
           <w:color w:val="000000" w:themeColor="text1"/>
           <w:sz w:val="24"/>
@@ -1198,7 +993,7 @@
       </w:r>
       <w:r>
         <w:rPr>
-          <w:rFonts w:ascii="Times New Roman" w:hAnsi="Times New Roman" w:cs="Times New Roman"/>
+          <w:rFonts w:ascii="Times New Roman" w:hAnsi="Times New Roman" w:cs="Times New Roman" w:eastAsia="Times New Roman"/>
           <w:b/>
           <w:color w:val="000000" w:themeColor="text1"/>
           <w:sz w:val="24"/>
@@ -1220,7 +1015,7 @@
       </w:hyperlink>
       <w:r>
         <w:rPr>
-          <w:rFonts w:ascii="Times New Roman" w:hAnsi="Times New Roman" w:cs="Times New Roman"/>
+          <w:rFonts w:ascii="Times New Roman" w:hAnsi="Times New Roman" w:cs="Times New Roman" w:eastAsia="Times New Roman"/>
           <w:b/>
           <w:color w:val="000000" w:themeColor="text1"/>
           <w:sz w:val="24"/>
@@ -1240,7 +1035,7 @@
       </w:pPr>
       <w:r>
         <w:rPr>
-          <w:rFonts w:ascii="Times New Roman" w:hAnsi="Times New Roman" w:cs="Times New Roman"/>
+          <w:rFonts w:ascii="Times New Roman" w:hAnsi="Times New Roman" w:cs="Times New Roman" w:eastAsia="Times New Roman"/>
           <w:sz w:val="24"/>
           <w:szCs w:val="24"/>
         </w:rPr>
@@ -1248,7 +1043,7 @@
       </w:r>
       <w:r>
         <w:rPr>
-          <w:rFonts w:ascii="Times New Roman" w:hAnsi="Times New Roman" w:cs="Times New Roman"/>
+          <w:rFonts w:ascii="Times New Roman" w:hAnsi="Times New Roman" w:cs="Times New Roman" w:eastAsia="Times New Roman"/>
           <w:b/>
           <w:sz w:val="24"/>
           <w:szCs w:val="24"/>
@@ -1257,7 +1052,7 @@
       </w:r>
       <w:r>
         <w:rPr>
-          <w:rFonts w:ascii="Times New Roman" w:hAnsi="Times New Roman" w:cs="Times New Roman"/>
+          <w:rFonts w:ascii="Times New Roman" w:hAnsi="Times New Roman" w:cs="Times New Roman" w:eastAsia="Times New Roman"/>
           <w:sz w:val="24"/>
           <w:szCs w:val="24"/>
         </w:rPr>
@@ -1277,7 +1072,7 @@
       </w:pPr>
       <w:r>
         <w:rPr>
-          <w:rFonts w:ascii="Times New Roman" w:hAnsi="Times New Roman" w:cs="Times New Roman"/>
+          <w:rFonts w:ascii="Times New Roman" w:hAnsi="Times New Roman" w:cs="Times New Roman" w:eastAsia="Times New Roman"/>
           <w:color w:val="000000" w:themeColor="text1"/>
           <w:sz w:val="24"/>
           <w:szCs w:val="24"/>
@@ -1596,7 +1391,55 @@
                 <w:sz w:val="24"/>
                 <w:szCs w:val="24"/>
               </w:rPr>
-              <w:t xml:space="preserve">  I understand how my research data will be coded, stored, and reported.</w:t>
+              <w:t xml:space="preserve">  I understand how my research data, including audio recordings, will be coded, stored, protected, and reported.</w:t>
+            </w:r>
+          </w:p>
+          <w:p>
+            <w:pPr>
+              <w:spacing w:after="40"/>
+              <w:jc w:val="both"/>
+              <w:rPr>
+                <w:rFonts w:ascii="Times New Roman" w:hAnsi="Times New Roman" w:cs="Times New Roman"/>
+                <w:color w:val="000000" w:themeColor="text1"/>
+                <w:sz w:val="24"/>
+                <w:szCs w:val="24"/>
+              </w:rPr>
+            </w:pPr>
+            <w:sdt>
+              <w:sdtPr>
+                <w:rPr>
+                  <w:rFonts w:ascii="Times New Roman" w:hAnsi="Times New Roman" w:cs="Times New Roman"/>
+                  <w:color w:val="000000" w:themeColor="text1"/>
+                  <w:sz w:val="24"/>
+                  <w:szCs w:val="24"/>
+                </w:rPr>
+                <w:id w:val="1646160601"/>
+                <w14:checkbox>
+                  <w14:checked w14:val="0"/>
+                  <w14:checkedState w14:val="2612" w14:font="MS Gothic"/>
+                  <w14:uncheckedState w14:val="2610" w14:font="MS Gothic"/>
+                </w14:checkbox>
+              </w:sdtPr>
+              <w:sdtContent>
+                <w:r>
+                  <w:rPr>
+                    <w:rFonts w:ascii="MS Gothic" w:eastAsia="MS Gothic" w:hAnsi="MS Gothic" w:cs="Times New Roman" w:hint="eastAsia"/>
+                    <w:color w:val="000000" w:themeColor="text1"/>
+                    <w:sz w:val="24"/>
+                    <w:szCs w:val="24"/>
+                  </w:rPr>
+                  <w:t>☐</w:t>
+                </w:r>
+              </w:sdtContent>
+            </w:sdt>
+            <w:r>
+              <w:rPr>
+                <w:rFonts w:ascii="Times New Roman" w:hAnsi="Times New Roman" w:cs="Times New Roman"/>
+                <w:color w:val="000000" w:themeColor="text1"/>
+                <w:sz w:val="24"/>
+                <w:szCs w:val="24"/>
+              </w:rPr>
+              <w:t xml:space="preserve">  I consent to audio recording of my communication during the VR scenarios for the research purposes described in this form.</w:t>
             </w:r>
           </w:p>
           <w:p>

</xml_diff>